<commit_message>
Add Week 1 deliverable: Inventory Problem Research Brief
</commit_message>
<xml_diff>
--- a/StockSense_Interactive_Checklist.docx
+++ b/StockSense_Interactive_Checklist.docx
@@ -332,13 +332,7 @@
               <w:rPr>
                 <w:sz w:val="18"/>
               </w:rPr>
-              <w:t xml:space="preserve">Study </w:t>
-            </w:r>
-            <w:r>
-              <w:rPr>
-                <w:sz w:val="18"/>
-              </w:rPr>
-              <w:t>Wheatstone bridge load cells, strain gauges, and 24-bit HX711 ADC operating principles.</w:t>
+              <w:t>Study Wheatstone bridge load cells, strain gauges, and 24-bit HX711 ADC operating principles.</w:t>
             </w:r>
           </w:p>
         </w:tc>
@@ -366,7 +360,7 @@
               <w:sdtPr>
                 <w:id w:val="-1847402890"/>
                 <w14:checkbox>
-                  <w14:checked w14:val="0"/>
+                  <w14:checked w14:val="1"/>
                   <w14:checkedState w14:val="2611" w14:font="MS Gothic"/>
                   <w14:uncheckedState w14:val="2610" w14:font="MS Gothic"/>
                 </w14:checkbox>
@@ -377,7 +371,7 @@
                   <w:rPr>
                     <w:rFonts w:ascii="MS Gothic" w:eastAsia="MS Gothic" w:hAnsi="MS Gothic" w:hint="eastAsia"/>
                   </w:rPr>
-                  <w:t>☐</w:t>
+                  <w:t>☑</w:t>
                 </w:r>
               </w:sdtContent>
             </w:sdt>
@@ -446,7 +440,7 @@
               <w:sdtPr>
                 <w:id w:val="-1151441617"/>
                 <w14:checkbox>
-                  <w14:checked w14:val="0"/>
+                  <w14:checked w14:val="1"/>
                   <w14:checkedState w14:val="2611" w14:font="MS Gothic"/>
                   <w14:uncheckedState w14:val="2610" w14:font="MS Gothic"/>
                 </w14:checkbox>
@@ -457,7 +451,7 @@
                   <w:rPr>
                     <w:rFonts w:ascii="MS Gothic" w:eastAsia="MS Gothic" w:hAnsi="MS Gothic" w:hint="eastAsia"/>
                   </w:rPr>
-                  <w:t>☐</w:t>
+                  <w:t>☑</w:t>
                 </w:r>
               </w:sdtContent>
             </w:sdt>
@@ -526,7 +520,7 @@
               <w:sdtPr>
                 <w:id w:val="577481722"/>
                 <w14:checkbox>
-                  <w14:checked w14:val="0"/>
+                  <w14:checked w14:val="1"/>
                   <w14:checkedState w14:val="2611" w14:font="MS Gothic"/>
                   <w14:uncheckedState w14:val="2610" w14:font="MS Gothic"/>
                 </w14:checkbox>
@@ -537,7 +531,7 @@
                   <w:rPr>
                     <w:rFonts w:ascii="MS Gothic" w:eastAsia="MS Gothic" w:hAnsi="MS Gothic" w:hint="eastAsia"/>
                   </w:rPr>
-                  <w:t>☐</w:t>
+                  <w:t>☑</w:t>
                 </w:r>
               </w:sdtContent>
             </w:sdt>
@@ -655,15 +649,7 @@
                 <w:color w:val="FFFFFF"/>
                 <w:sz w:val="19"/>
               </w:rPr>
-              <w:t>Task T</w:t>
-            </w:r>
-            <w:r>
-              <w:rPr>
-                <w:b/>
-                <w:color w:val="FFFFFF"/>
-                <w:sz w:val="19"/>
-              </w:rPr>
-              <w:t>itle</w:t>
+              <w:t>Task Title</w:t>
             </w:r>
           </w:p>
         </w:tc>
@@ -874,13 +860,7 @@
               <w:rPr>
                 <w:sz w:val="18"/>
               </w:rPr>
-              <w:t xml:space="preserve">Define 3-4 target </w:t>
-            </w:r>
-            <w:r>
-              <w:rPr>
-                <w:sz w:val="18"/>
-              </w:rPr>
-              <w:t>customer personas and draft top 10 detailed operational use-cases.</w:t>
+              <w:t>Define 3-4 target customer personas and draft top 10 detailed operational use-cases.</w:t>
             </w:r>
           </w:p>
         </w:tc>
@@ -1059,15 +1039,7 @@
                 <w:color w:val="FFFFFF"/>
                 <w:sz w:val="19"/>
               </w:rPr>
-              <w:t>Description &amp; Deliverable Deta</w:t>
-            </w:r>
-            <w:r>
-              <w:rPr>
-                <w:b/>
-                <w:color w:val="FFFFFF"/>
-                <w:sz w:val="19"/>
-              </w:rPr>
-              <w:t>ils</w:t>
+              <w:t>Description &amp; Deliverable Details</w:t>
             </w:r>
           </w:p>
         </w:tc>
@@ -1257,13 +1229,7 @@
               <w:rPr>
                 <w:sz w:val="18"/>
               </w:rPr>
-              <w:t xml:space="preserve">Establish measurable targets (weighing accuracy, alert </w:t>
-            </w:r>
-            <w:r>
-              <w:rPr>
-                <w:sz w:val="18"/>
-              </w:rPr>
-              <w:t>latency, battery backup, cost/node).</w:t>
+              <w:t>Establish measurable targets (weighing accuracy, alert latency, battery backup, cost/node).</w:t>
             </w:r>
           </w:p>
         </w:tc>
@@ -1471,15 +1437,7 @@
                 <w:color w:val="1877F2"/>
                 <w:sz w:val="21"/>
               </w:rPr>
-              <w:t xml:space="preserve">Week 4: System </w:t>
-            </w:r>
-            <w:r>
-              <w:rPr>
-                <w:b/>
-                <w:color w:val="1877F2"/>
-                <w:sz w:val="21"/>
-              </w:rPr>
-              <w:t>Architecture &amp; Data Spec</w:t>
+              <w:t>Week 4: System Architecture &amp; Data Spec</w:t>
             </w:r>
           </w:p>
         </w:tc>
@@ -1639,13 +1597,7 @@
               <w:rPr>
                 <w:sz w:val="18"/>
               </w:rPr>
-              <w:t xml:space="preserve">Select and justify target MCU, ADC, load cell, environmental sensors, and power </w:t>
-            </w:r>
-            <w:r>
-              <w:rPr>
-                <w:sz w:val="18"/>
-              </w:rPr>
-              <w:t>management ICs.</w:t>
+              <w:t>Select and justify target MCU, ADC, load cell, environmental sensors, and power management ICs.</w:t>
             </w:r>
           </w:p>
         </w:tc>
@@ -1867,15 +1819,7 @@
                 <w:color w:val="1877F2"/>
                 <w:sz w:val="21"/>
               </w:rPr>
-              <w:t xml:space="preserve">Week 5: </w:t>
-            </w:r>
-            <w:r>
-              <w:rPr>
-                <w:b/>
-                <w:color w:val="1877F2"/>
-                <w:sz w:val="21"/>
-              </w:rPr>
-              <w:t>Hardware Design &amp; Simulation</w:t>
+              <w:t>Week 5: Hardware Design &amp; Simulation</w:t>
             </w:r>
           </w:p>
         </w:tc>
@@ -2035,13 +1979,7 @@
               <w:rPr>
                 <w:sz w:val="18"/>
               </w:rPr>
-              <w:t xml:space="preserve">Simulate analog/power front-end in LTspice to verify strain gauge </w:t>
-            </w:r>
-            <w:r>
-              <w:rPr>
-                <w:sz w:val="18"/>
-              </w:rPr>
-              <w:t>excitation and battery charger budget.</w:t>
+              <w:t>Simulate analog/power front-end in LTspice to verify strain gauge excitation and battery charger budget.</w:t>
             </w:r>
           </w:p>
         </w:tc>
@@ -2249,15 +2187,7 @@
                 <w:color w:val="1877F2"/>
                 <w:sz w:val="21"/>
               </w:rPr>
-              <w:t xml:space="preserve">Week 6: PCB Layout &amp; </w:t>
-            </w:r>
-            <w:r>
-              <w:rPr>
-                <w:b/>
-                <w:color w:val="1877F2"/>
-                <w:sz w:val="21"/>
-              </w:rPr>
-              <w:t>Enclosure Design</w:t>
+              <w:t>Week 6: PCB Layout &amp; Enclosure Design</w:t>
             </w:r>
           </w:p>
         </w:tc>
@@ -2478,14 +2408,7 @@
                 <w:b/>
                 <w:sz w:val="19"/>
               </w:rPr>
-              <w:t xml:space="preserve">3D </w:t>
-            </w:r>
-            <w:r>
-              <w:rPr>
-                <w:b/>
-                <w:sz w:val="19"/>
-              </w:rPr>
-              <w:t>CAD Enclosure Model</w:t>
+              <w:t>3D CAD Enclosure Model</w:t>
             </w:r>
           </w:p>
         </w:tc>
@@ -2693,14 +2616,7 @@
                 <w:b/>
                 <w:sz w:val="19"/>
               </w:rPr>
-              <w:t xml:space="preserve">Firmware </w:t>
-            </w:r>
-            <w:r>
-              <w:rPr>
-                <w:b/>
-                <w:sz w:val="19"/>
-              </w:rPr>
-              <w:t>Architecture Plan</w:t>
+              <w:t>Firmware Architecture Plan</w:t>
             </w:r>
           </w:p>
         </w:tc>
@@ -2860,14 +2776,7 @@
                 <w:b/>
                 <w:sz w:val="19"/>
               </w:rPr>
-              <w:t xml:space="preserve">Local Docker </w:t>
-            </w:r>
-            <w:r>
-              <w:rPr>
-                <w:b/>
-                <w:sz w:val="19"/>
-              </w:rPr>
-              <w:t>Cloud Stack</w:t>
+              <w:t>Local Docker Cloud Stack</w:t>
             </w:r>
           </w:p>
         </w:tc>
@@ -3075,14 +2984,7 @@
                 <w:b/>
                 <w:sz w:val="19"/>
               </w:rPr>
-              <w:t xml:space="preserve">Figma UI &amp; Frontend </w:t>
-            </w:r>
-            <w:r>
-              <w:rPr>
-                <w:b/>
-                <w:sz w:val="19"/>
-              </w:rPr>
-              <w:t>Mockup</w:t>
+              <w:t>Figma UI &amp; Frontend Mockup</w:t>
             </w:r>
           </w:p>
         </w:tc>
@@ -3242,14 +3144,7 @@
                 <w:b/>
                 <w:sz w:val="19"/>
               </w:rPr>
-              <w:t xml:space="preserve">End-to-End </w:t>
-            </w:r>
-            <w:r>
-              <w:rPr>
-                <w:b/>
-                <w:sz w:val="19"/>
-              </w:rPr>
-              <w:t>Simulation Integration</w:t>
+              <w:t>End-to-End Simulation Integration</w:t>
             </w:r>
           </w:p>
         </w:tc>
@@ -3415,15 +3310,7 @@
                 <w:color w:val="FFFFFF"/>
                 <w:sz w:val="18"/>
               </w:rPr>
-              <w:t>W</w:t>
-            </w:r>
-            <w:r>
-              <w:rPr>
-                <w:b/>
-                <w:color w:val="FFFFFF"/>
-                <w:sz w:val="18"/>
-              </w:rPr>
-              <w:t>eek</w:t>
+              <w:t>Week</w:t>
             </w:r>
           </w:p>
         </w:tc>
@@ -4523,11 +4410,6 @@
     <w:lsdException w:name="Book Title" w:uiPriority="33" w:qFormat="1"/>
     <w:lsdException w:name="Bibliography" w:semiHidden="1" w:uiPriority="37" w:unhideWhenUsed="1"/>
     <w:lsdException w:name="TOC Heading" w:semiHidden="1" w:uiPriority="39" w:unhideWhenUsed="1" w:qFormat="1"/>
-    <w:lsdException w:name="Plain Table 5" w:semiHidden="1" w:unhideWhenUsed="1"/>
-    <w:lsdException w:name="Grid Table Light" w:semiHidden="1" w:unhideWhenUsed="1"/>
-    <w:lsdException w:name="Grid Table 1 Light" w:semiHidden="1" w:unhideWhenUsed="1"/>
-    <w:lsdException w:name="Grid Table 2" w:semiHidden="1" w:unhideWhenUsed="1"/>
-    <w:lsdException w:name="Grid Table 3" w:semiHidden="1" w:unhideWhenUsed="1"/>
     <w:lsdException w:name="Grid Table 4" w:uiPriority="49"/>
     <w:lsdException w:name="Grid Table 5 Dark" w:uiPriority="50"/>
     <w:lsdException w:name="Grid Table 6 Colorful" w:uiPriority="51"/>

</xml_diff>

<commit_message>
Add Week 2 deliverable: StockSense_Week_2_Market_and_Competitor_Study PDF
</commit_message>
<xml_diff>
--- a/StockSense_Interactive_Checklist.docx
+++ b/StockSense_Interactive_Checklist.docx
@@ -9,7 +9,25 @@
           <w:color w:val="1877F2"/>
           <w:sz w:val="18"/>
         </w:rPr>
-        <w:t>CODEXUS TECHNOLOGIES  |  STOCKSENSE PROJECT</w:t>
+        <w:t xml:space="preserve">CODEXUS </w:t>
+      </w:r>
+      <w:proofErr w:type="gramStart"/>
+      <w:r>
+        <w:rPr>
+          <w:b/>
+          <w:color w:val="1877F2"/>
+          <w:sz w:val="18"/>
+        </w:rPr>
+        <w:t>TECHNOLOGIES  |</w:t>
+      </w:r>
+      <w:proofErr w:type="gramEnd"/>
+      <w:r>
+        <w:rPr>
+          <w:b/>
+          <w:color w:val="1877F2"/>
+          <w:sz w:val="18"/>
+        </w:rPr>
+        <w:t xml:space="preserve">  STOCKSENSE PROJECT</w:t>
       </w:r>
       <w:r>
         <w:rPr>
@@ -38,8 +56,46 @@
           <w:color w:val="646464"/>
           <w:sz w:val="19"/>
         </w:rPr>
-        <w:t>Trainee: Kavindu Hasaranga  |  Role: Electronics &amp; IoT Trainee  |  Supervisor: Anjana Suraweera</w:t>
+        <w:t xml:space="preserve">Trainee: Kavindu </w:t>
       </w:r>
+      <w:proofErr w:type="spellStart"/>
+      <w:proofErr w:type="gramStart"/>
+      <w:r>
+        <w:rPr>
+          <w:i/>
+          <w:color w:val="646464"/>
+          <w:sz w:val="19"/>
+        </w:rPr>
+        <w:t>Hasaranga</w:t>
+      </w:r>
+      <w:proofErr w:type="spellEnd"/>
+      <w:r>
+        <w:rPr>
+          <w:i/>
+          <w:color w:val="646464"/>
+          <w:sz w:val="19"/>
+        </w:rPr>
+        <w:t xml:space="preserve">  |</w:t>
+      </w:r>
+      <w:proofErr w:type="gramEnd"/>
+      <w:r>
+        <w:rPr>
+          <w:i/>
+          <w:color w:val="646464"/>
+          <w:sz w:val="19"/>
+        </w:rPr>
+        <w:t xml:space="preserve">  Role: Electronics &amp; IoT Trainee  |  Supervisor: Anjana </w:t>
+      </w:r>
+      <w:proofErr w:type="spellStart"/>
+      <w:r>
+        <w:rPr>
+          <w:i/>
+          <w:color w:val="646464"/>
+          <w:sz w:val="19"/>
+        </w:rPr>
+        <w:t>Suraweera</w:t>
+      </w:r>
+      <w:proofErr w:type="spellEnd"/>
     </w:p>
     <w:p>
       <w:pPr>
@@ -166,6 +222,11 @@
             </w:tcMar>
           </w:tcPr>
           <w:p>
+            <w:pPr>
+              <w:tabs>
+                <w:tab w:val="center" w:pos="4848"/>
+              </w:tabs>
+            </w:pPr>
             <w:r>
               <w:rPr>
                 <w:b/>
@@ -173,6 +234,14 @@
                 <w:sz w:val="21"/>
               </w:rPr>
               <w:t>Week 1: Onboarding &amp; Problem Research</w:t>
+            </w:r>
+            <w:r>
+              <w:rPr>
+                <w:b/>
+                <w:color w:val="1877F2"/>
+                <w:sz w:val="21"/>
+              </w:rPr>
+              <w:t xml:space="preserve"> – 2026/10/05 (End)</w:t>
             </w:r>
           </w:p>
         </w:tc>
@@ -252,7 +321,35 @@
               <w:rPr>
                 <w:sz w:val="18"/>
               </w:rPr>
-              <w:t>Install Git, GitHub keys, KiCad, VS Code + PlatformIO, Docker, Python 3.10+, Node.js, Figma, MQTT Explorer.</w:t>
+              <w:t xml:space="preserve">Install Git, GitHub keys, </w:t>
+            </w:r>
+            <w:proofErr w:type="spellStart"/>
+            <w:r>
+              <w:rPr>
+                <w:sz w:val="18"/>
+              </w:rPr>
+              <w:t>KiCad</w:t>
+            </w:r>
+            <w:proofErr w:type="spellEnd"/>
+            <w:r>
+              <w:rPr>
+                <w:sz w:val="18"/>
+              </w:rPr>
+              <w:t xml:space="preserve">, VS Code + </w:t>
+            </w:r>
+            <w:proofErr w:type="spellStart"/>
+            <w:r>
+              <w:rPr>
+                <w:sz w:val="18"/>
+              </w:rPr>
+              <w:t>PlatformIO</w:t>
+            </w:r>
+            <w:proofErr w:type="spellEnd"/>
+            <w:r>
+              <w:rPr>
+                <w:sz w:val="18"/>
+              </w:rPr>
+              <w:t>, Docker, Python 3.10+, Node.js, Figma, MQTT Explorer.</w:t>
             </w:r>
           </w:p>
         </w:tc>
@@ -702,6 +799,14 @@
               </w:rPr>
               <w:t>Week 2: Market &amp; Competitor Study</w:t>
             </w:r>
+            <w:r>
+              <w:rPr>
+                <w:b/>
+                <w:color w:val="1877F2"/>
+                <w:sz w:val="21"/>
+              </w:rPr>
+              <w:t xml:space="preserve"> – 2026/10/12 (End)</w:t>
+            </w:r>
           </w:p>
         </w:tc>
       </w:tr>
@@ -728,7 +833,7 @@
               <w:sdtPr>
                 <w:id w:val="142164320"/>
                 <w14:checkbox>
-                  <w14:checked w14:val="0"/>
+                  <w14:checked w14:val="1"/>
                   <w14:checkedState w14:val="2611" w14:font="MS Gothic"/>
                   <w14:uncheckedState w14:val="2610" w14:font="MS Gothic"/>
                 </w14:checkbox>
@@ -739,7 +844,7 @@
                   <w:rPr>
                     <w:rFonts w:ascii="MS Gothic" w:eastAsia="MS Gothic" w:hAnsi="MS Gothic" w:hint="eastAsia"/>
                   </w:rPr>
-                  <w:t>☐</w:t>
+                  <w:t>☑</w:t>
                 </w:r>
               </w:sdtContent>
             </w:sdt>
@@ -808,7 +913,7 @@
               <w:sdtPr>
                 <w:id w:val="1074867432"/>
                 <w14:checkbox>
-                  <w14:checked w14:val="0"/>
+                  <w14:checked w14:val="1"/>
                   <w14:checkedState w14:val="2611" w14:font="MS Gothic"/>
                   <w14:uncheckedState w14:val="2610" w14:font="MS Gothic"/>
                 </w14:checkbox>
@@ -819,7 +924,7 @@
                   <w:rPr>
                     <w:rFonts w:ascii="MS Gothic" w:eastAsia="MS Gothic" w:hAnsi="MS Gothic" w:hint="eastAsia"/>
                   </w:rPr>
-                  <w:t>☐</w:t>
+                  <w:t>☑</w:t>
                 </w:r>
               </w:sdtContent>
             </w:sdt>
@@ -888,7 +993,7 @@
               <w:sdtPr>
                 <w:id w:val="39409100"/>
                 <w14:checkbox>
-                  <w14:checked w14:val="0"/>
+                  <w14:checked w14:val="1"/>
                   <w14:checkedState w14:val="2611" w14:font="MS Gothic"/>
                   <w14:uncheckedState w14:val="2610" w14:font="MS Gothic"/>
                 </w14:checkbox>
@@ -899,7 +1004,7 @@
                   <w:rPr>
                     <w:rFonts w:ascii="MS Gothic" w:eastAsia="MS Gothic" w:hAnsi="MS Gothic" w:hint="eastAsia"/>
                   </w:rPr>
-                  <w:t>☐</w:t>
+                  <w:t>☑</w:t>
                 </w:r>
               </w:sdtContent>
             </w:sdt>
@@ -951,6 +1056,11 @@
         <w:spacing w:after="160"/>
       </w:pPr>
     </w:p>
+    <w:p>
+      <w:pPr>
+        <w:spacing w:after="160"/>
+      </w:pPr>
+    </w:p>
     <w:tbl>
       <w:tblPr>
         <w:tblW w:w="0" w:type="auto"/>
@@ -995,6 +1105,7 @@
                 <w:color w:val="FFFFFF"/>
                 <w:sz w:val="19"/>
               </w:rPr>
+              <w:lastRenderedPageBreak/>
               <w:t>Click to Mark</w:t>
             </w:r>
           </w:p>
@@ -1068,7 +1179,6 @@
                 <w:color w:val="1877F2"/>
                 <w:sz w:val="21"/>
               </w:rPr>
-              <w:lastRenderedPageBreak/>
               <w:t>Week 3: System Requirements &amp; KPIs</w:t>
             </w:r>
           </w:p>
@@ -1875,12 +1985,21 @@
             </w:tcMar>
           </w:tcPr>
           <w:p>
+            <w:proofErr w:type="spellStart"/>
             <w:r>
               <w:rPr>
                 <w:b/>
                 <w:sz w:val="19"/>
               </w:rPr>
-              <w:t>KiCad Schematic Capture</w:t>
+              <w:t>KiCad</w:t>
+            </w:r>
+            <w:proofErr w:type="spellEnd"/>
+            <w:r>
+              <w:rPr>
+                <w:b/>
+                <w:sz w:val="19"/>
+              </w:rPr>
+              <w:t xml:space="preserve"> Schematic Capture</w:t>
             </w:r>
           </w:p>
         </w:tc>
@@ -1899,7 +2018,21 @@
               <w:rPr>
                 <w:sz w:val="18"/>
               </w:rPr>
-              <w:t>Draw full schematic in KiCad including ESP32 MCU, HX711 ADC, RFID, I2C/SPI sensors, and power circuit.</w:t>
+              <w:t xml:space="preserve">Draw full schematic in </w:t>
+            </w:r>
+            <w:proofErr w:type="spellStart"/>
+            <w:r>
+              <w:rPr>
+                <w:sz w:val="18"/>
+              </w:rPr>
+              <w:t>KiCad</w:t>
+            </w:r>
+            <w:proofErr w:type="spellEnd"/>
+            <w:r>
+              <w:rPr>
+                <w:sz w:val="18"/>
+              </w:rPr>
+              <w:t xml:space="preserve"> including ESP32 MCU, HX711 ADC, RFID, I2C/SPI sensors, and power circuit.</w:t>
             </w:r>
           </w:p>
         </w:tc>
@@ -1979,7 +2112,21 @@
               <w:rPr>
                 <w:sz w:val="18"/>
               </w:rPr>
-              <w:t>Simulate analog/power front-end in LTspice to verify strain gauge excitation and battery charger budget.</w:t>
+              <w:t xml:space="preserve">Simulate analog/power front-end in </w:t>
+            </w:r>
+            <w:proofErr w:type="spellStart"/>
+            <w:r>
+              <w:rPr>
+                <w:sz w:val="18"/>
+              </w:rPr>
+              <w:t>LTspice</w:t>
+            </w:r>
+            <w:proofErr w:type="spellEnd"/>
+            <w:r>
+              <w:rPr>
+                <w:sz w:val="18"/>
+              </w:rPr>
+              <w:t xml:space="preserve"> to verify strain gauge excitation and battery charger budget.</w:t>
             </w:r>
           </w:p>
         </w:tc>
@@ -2243,12 +2390,21 @@
             </w:tcMar>
           </w:tcPr>
           <w:p>
+            <w:proofErr w:type="spellStart"/>
             <w:r>
               <w:rPr>
                 <w:b/>
                 <w:sz w:val="19"/>
               </w:rPr>
-              <w:t>KiCad PCB Layout</w:t>
+              <w:t>KiCad</w:t>
+            </w:r>
+            <w:proofErr w:type="spellEnd"/>
+            <w:r>
+              <w:rPr>
+                <w:b/>
+                <w:sz w:val="19"/>
+              </w:rPr>
+              <w:t xml:space="preserve"> PCB Layout</w:t>
             </w:r>
           </w:p>
         </w:tc>
@@ -2427,7 +2583,21 @@
               <w:rPr>
                 <w:sz w:val="18"/>
               </w:rPr>
-              <w:t>Design custom 3D enclosure and load-cell mechanical mounting platform in FreeCAD / Fusion 360.</w:t>
+              <w:t xml:space="preserve">Design custom 3D enclosure and load-cell mechanical mounting platform in </w:t>
+            </w:r>
+            <w:proofErr w:type="spellStart"/>
+            <w:r>
+              <w:rPr>
+                <w:sz w:val="18"/>
+              </w:rPr>
+              <w:t>FreeCAD</w:t>
+            </w:r>
+            <w:proofErr w:type="spellEnd"/>
+            <w:r>
+              <w:rPr>
+                <w:sz w:val="18"/>
+              </w:rPr>
+              <w:t xml:space="preserve"> / Fusion 360.</w:t>
             </w:r>
           </w:p>
         </w:tc>
@@ -2691,12 +2861,21 @@
             </w:tcMar>
           </w:tcPr>
           <w:p>
+            <w:proofErr w:type="spellStart"/>
             <w:r>
               <w:rPr>
                 <w:b/>
                 <w:sz w:val="19"/>
               </w:rPr>
-              <w:t>Wokwi ESP32 Simulation</w:t>
+              <w:t>Wokwi</w:t>
+            </w:r>
+            <w:proofErr w:type="spellEnd"/>
+            <w:r>
+              <w:rPr>
+                <w:b/>
+                <w:sz w:val="19"/>
+              </w:rPr>
+              <w:t xml:space="preserve"> ESP32 Simulation</w:t>
             </w:r>
           </w:p>
         </w:tc>
@@ -2715,7 +2894,21 @@
               <w:rPr>
                 <w:sz w:val="18"/>
               </w:rPr>
-              <w:t>Simulate ESP32 firmware on Wokwi publishing live dummy telemetry over MQTT to broker.</w:t>
+              <w:t xml:space="preserve">Simulate ESP32 firmware on </w:t>
+            </w:r>
+            <w:proofErr w:type="spellStart"/>
+            <w:r>
+              <w:rPr>
+                <w:sz w:val="18"/>
+              </w:rPr>
+              <w:t>Wokwi</w:t>
+            </w:r>
+            <w:proofErr w:type="spellEnd"/>
+            <w:r>
+              <w:rPr>
+                <w:sz w:val="18"/>
+              </w:rPr>
+              <w:t xml:space="preserve"> publishing live dummy telemetry over MQTT to broker.</w:t>
             </w:r>
           </w:p>
         </w:tc>
@@ -2795,7 +2988,49 @@
               <w:rPr>
                 <w:sz w:val="18"/>
               </w:rPr>
-              <w:t>Spin up local Docker environment running Mosquitto MQTT broker, TimescaleDB, and FastAPI REST API.</w:t>
+              <w:t xml:space="preserve">Spin up local Docker environment running </w:t>
+            </w:r>
+            <w:proofErr w:type="spellStart"/>
+            <w:r>
+              <w:rPr>
+                <w:sz w:val="18"/>
+              </w:rPr>
+              <w:t>Mosquitto</w:t>
+            </w:r>
+            <w:proofErr w:type="spellEnd"/>
+            <w:r>
+              <w:rPr>
+                <w:sz w:val="18"/>
+              </w:rPr>
+              <w:t xml:space="preserve"> MQTT broker, </w:t>
+            </w:r>
+            <w:proofErr w:type="spellStart"/>
+            <w:r>
+              <w:rPr>
+                <w:sz w:val="18"/>
+              </w:rPr>
+              <w:t>TimescaleDB</w:t>
+            </w:r>
+            <w:proofErr w:type="spellEnd"/>
+            <w:r>
+              <w:rPr>
+                <w:sz w:val="18"/>
+              </w:rPr>
+              <w:t xml:space="preserve">, and </w:t>
+            </w:r>
+            <w:proofErr w:type="spellStart"/>
+            <w:r>
+              <w:rPr>
+                <w:sz w:val="18"/>
+              </w:rPr>
+              <w:t>FastAPI</w:t>
+            </w:r>
+            <w:proofErr w:type="spellEnd"/>
+            <w:r>
+              <w:rPr>
+                <w:sz w:val="18"/>
+              </w:rPr>
+              <w:t xml:space="preserve"> REST API.</w:t>
             </w:r>
           </w:p>
         </w:tc>
@@ -3163,7 +3398,21 @@
               <w:rPr>
                 <w:sz w:val="18"/>
               </w:rPr>
-              <w:t>Demonstrate full pipeline: Wokwi Node -&gt; MQTT -&gt; Database -&gt; Web Dashboard -&gt; AI Analytics.</w:t>
+              <w:t xml:space="preserve">Demonstrate full pipeline: </w:t>
+            </w:r>
+            <w:proofErr w:type="spellStart"/>
+            <w:r>
+              <w:rPr>
+                <w:sz w:val="18"/>
+              </w:rPr>
+              <w:t>Wokwi</w:t>
+            </w:r>
+            <w:proofErr w:type="spellEnd"/>
+            <w:r>
+              <w:rPr>
+                <w:sz w:val="18"/>
+              </w:rPr>
+              <w:t xml:space="preserve"> Node -&gt; MQTT -&gt; Database -&gt; Web Dashboard -&gt; AI Analytics.</w:t>
             </w:r>
           </w:p>
         </w:tc>
@@ -3243,7 +3492,21 @@
               <w:rPr>
                 <w:sz w:val="18"/>
               </w:rPr>
-              <w:t>Compile final Design Package and conduct Gate 1 Design Review with Anjana Suraweera.</w:t>
+              <w:t xml:space="preserve">Compile final Design Package and conduct Gate 1 Design Review with Anjana </w:t>
+            </w:r>
+            <w:proofErr w:type="spellStart"/>
+            <w:r>
+              <w:rPr>
+                <w:sz w:val="18"/>
+              </w:rPr>
+              <w:t>Suraweera</w:t>
+            </w:r>
+            <w:proofErr w:type="spellEnd"/>
+            <w:r>
+              <w:rPr>
+                <w:sz w:val="18"/>
+              </w:rPr>
+              <w:t>.</w:t>
             </w:r>
           </w:p>
         </w:tc>

</xml_diff>

<commit_message>
Add Week 3 deliverable: StockSense - Risk Register , Engineering KPI Target Sheet PDF and System Requirements Specification (SRS) PDF
</commit_message>
<xml_diff>
--- a/StockSense_Interactive_Checklist.docx
+++ b/StockSense_Interactive_Checklist.docx
@@ -58,7 +58,6 @@
         </w:rPr>
         <w:t xml:space="preserve">Trainee: Kavindu </w:t>
       </w:r>
-      <w:proofErr w:type="spellStart"/>
       <w:proofErr w:type="gramStart"/>
       <w:r>
         <w:rPr>
@@ -66,16 +65,7 @@
           <w:color w:val="646464"/>
           <w:sz w:val="19"/>
         </w:rPr>
-        <w:t>Hasaranga</w:t>
-      </w:r>
-      <w:proofErr w:type="spellEnd"/>
-      <w:r>
-        <w:rPr>
-          <w:i/>
-          <w:color w:val="646464"/>
-          <w:sz w:val="19"/>
-        </w:rPr>
-        <w:t xml:space="preserve">  |</w:t>
+        <w:t>Hasaranga  |</w:t>
       </w:r>
       <w:proofErr w:type="gramEnd"/>
       <w:r>
@@ -84,18 +74,8 @@
           <w:color w:val="646464"/>
           <w:sz w:val="19"/>
         </w:rPr>
-        <w:t xml:space="preserve">  Role: Electronics &amp; IoT Trainee  |  Supervisor: Anjana </w:t>
+        <w:t xml:space="preserve">  Role: Electronics &amp; IoT Trainee  |  Supervisor: Anjana Suraweera</w:t>
       </w:r>
-      <w:proofErr w:type="spellStart"/>
-      <w:r>
-        <w:rPr>
-          <w:i/>
-          <w:color w:val="646464"/>
-          <w:sz w:val="19"/>
-        </w:rPr>
-        <w:t>Suraweera</w:t>
-      </w:r>
-      <w:proofErr w:type="spellEnd"/>
     </w:p>
     <w:p>
       <w:pPr>
@@ -321,35 +301,7 @@
               <w:rPr>
                 <w:sz w:val="18"/>
               </w:rPr>
-              <w:t xml:space="preserve">Install Git, GitHub keys, </w:t>
-            </w:r>
-            <w:proofErr w:type="spellStart"/>
-            <w:r>
-              <w:rPr>
-                <w:sz w:val="18"/>
-              </w:rPr>
-              <w:t>KiCad</w:t>
-            </w:r>
-            <w:proofErr w:type="spellEnd"/>
-            <w:r>
-              <w:rPr>
-                <w:sz w:val="18"/>
-              </w:rPr>
-              <w:t xml:space="preserve">, VS Code + </w:t>
-            </w:r>
-            <w:proofErr w:type="spellStart"/>
-            <w:r>
-              <w:rPr>
-                <w:sz w:val="18"/>
-              </w:rPr>
-              <w:t>PlatformIO</w:t>
-            </w:r>
-            <w:proofErr w:type="spellEnd"/>
-            <w:r>
-              <w:rPr>
-                <w:sz w:val="18"/>
-              </w:rPr>
-              <w:t>, Docker, Python 3.10+, Node.js, Figma, MQTT Explorer.</w:t>
+              <w:t>Install Git, GitHub keys, KiCad, VS Code + PlatformIO, Docker, Python 3.10+, Node.js, Figma, MQTT Explorer.</w:t>
             </w:r>
           </w:p>
         </w:tc>
@@ -1207,7 +1159,7 @@
               <w:sdtPr>
                 <w:id w:val="-1095165816"/>
                 <w14:checkbox>
-                  <w14:checked w14:val="0"/>
+                  <w14:checked w14:val="1"/>
                   <w14:checkedState w14:val="2611" w14:font="MS Gothic"/>
                   <w14:uncheckedState w14:val="2610" w14:font="MS Gothic"/>
                 </w14:checkbox>
@@ -1218,7 +1170,7 @@
                   <w:rPr>
                     <w:rFonts w:ascii="MS Gothic" w:eastAsia="MS Gothic" w:hAnsi="MS Gothic" w:hint="eastAsia"/>
                   </w:rPr>
-                  <w:t>☐</w:t>
+                  <w:t>☑</w:t>
                 </w:r>
               </w:sdtContent>
             </w:sdt>
@@ -1287,7 +1239,7 @@
               <w:sdtPr>
                 <w:id w:val="1928996964"/>
                 <w14:checkbox>
-                  <w14:checked w14:val="0"/>
+                  <w14:checked w14:val="1"/>
                   <w14:checkedState w14:val="2611" w14:font="MS Gothic"/>
                   <w14:uncheckedState w14:val="2610" w14:font="MS Gothic"/>
                 </w14:checkbox>
@@ -1298,7 +1250,7 @@
                   <w:rPr>
                     <w:rFonts w:ascii="MS Gothic" w:eastAsia="MS Gothic" w:hAnsi="MS Gothic" w:hint="eastAsia"/>
                   </w:rPr>
-                  <w:t>☐</w:t>
+                  <w:t>☑</w:t>
                 </w:r>
               </w:sdtContent>
             </w:sdt>
@@ -1367,7 +1319,7 @@
               <w:sdtPr>
                 <w:id w:val="-425657583"/>
                 <w14:checkbox>
-                  <w14:checked w14:val="0"/>
+                  <w14:checked w14:val="1"/>
                   <w14:checkedState w14:val="2611" w14:font="MS Gothic"/>
                   <w14:uncheckedState w14:val="2610" w14:font="MS Gothic"/>
                 </w14:checkbox>
@@ -1378,7 +1330,7 @@
                   <w:rPr>
                     <w:rFonts w:ascii="MS Gothic" w:eastAsia="MS Gothic" w:hAnsi="MS Gothic" w:hint="eastAsia"/>
                   </w:rPr>
-                  <w:t>☐</w:t>
+                  <w:t>☑</w:t>
                 </w:r>
               </w:sdtContent>
             </w:sdt>
@@ -1985,21 +1937,12 @@
             </w:tcMar>
           </w:tcPr>
           <w:p>
-            <w:proofErr w:type="spellStart"/>
             <w:r>
               <w:rPr>
                 <w:b/>
                 <w:sz w:val="19"/>
               </w:rPr>
-              <w:t>KiCad</w:t>
-            </w:r>
-            <w:proofErr w:type="spellEnd"/>
-            <w:r>
-              <w:rPr>
-                <w:b/>
-                <w:sz w:val="19"/>
-              </w:rPr>
-              <w:t xml:space="preserve"> Schematic Capture</w:t>
+              <w:t>KiCad Schematic Capture</w:t>
             </w:r>
           </w:p>
         </w:tc>
@@ -2018,21 +1961,7 @@
               <w:rPr>
                 <w:sz w:val="18"/>
               </w:rPr>
-              <w:t xml:space="preserve">Draw full schematic in </w:t>
-            </w:r>
-            <w:proofErr w:type="spellStart"/>
-            <w:r>
-              <w:rPr>
-                <w:sz w:val="18"/>
-              </w:rPr>
-              <w:t>KiCad</w:t>
-            </w:r>
-            <w:proofErr w:type="spellEnd"/>
-            <w:r>
-              <w:rPr>
-                <w:sz w:val="18"/>
-              </w:rPr>
-              <w:t xml:space="preserve"> including ESP32 MCU, HX711 ADC, RFID, I2C/SPI sensors, and power circuit.</w:t>
+              <w:t>Draw full schematic in KiCad including ESP32 MCU, HX711 ADC, RFID, I2C/SPI sensors, and power circuit.</w:t>
             </w:r>
           </w:p>
         </w:tc>
@@ -2112,21 +2041,7 @@
               <w:rPr>
                 <w:sz w:val="18"/>
               </w:rPr>
-              <w:t xml:space="preserve">Simulate analog/power front-end in </w:t>
-            </w:r>
-            <w:proofErr w:type="spellStart"/>
-            <w:r>
-              <w:rPr>
-                <w:sz w:val="18"/>
-              </w:rPr>
-              <w:t>LTspice</w:t>
-            </w:r>
-            <w:proofErr w:type="spellEnd"/>
-            <w:r>
-              <w:rPr>
-                <w:sz w:val="18"/>
-              </w:rPr>
-              <w:t xml:space="preserve"> to verify strain gauge excitation and battery charger budget.</w:t>
+              <w:t>Simulate analog/power front-end in LTspice to verify strain gauge excitation and battery charger budget.</w:t>
             </w:r>
           </w:p>
         </w:tc>
@@ -2390,21 +2305,12 @@
             </w:tcMar>
           </w:tcPr>
           <w:p>
-            <w:proofErr w:type="spellStart"/>
             <w:r>
               <w:rPr>
                 <w:b/>
                 <w:sz w:val="19"/>
               </w:rPr>
-              <w:t>KiCad</w:t>
-            </w:r>
-            <w:proofErr w:type="spellEnd"/>
-            <w:r>
-              <w:rPr>
-                <w:b/>
-                <w:sz w:val="19"/>
-              </w:rPr>
-              <w:t xml:space="preserve"> PCB Layout</w:t>
+              <w:t>KiCad PCB Layout</w:t>
             </w:r>
           </w:p>
         </w:tc>
@@ -2583,21 +2489,7 @@
               <w:rPr>
                 <w:sz w:val="18"/>
               </w:rPr>
-              <w:t xml:space="preserve">Design custom 3D enclosure and load-cell mechanical mounting platform in </w:t>
-            </w:r>
-            <w:proofErr w:type="spellStart"/>
-            <w:r>
-              <w:rPr>
-                <w:sz w:val="18"/>
-              </w:rPr>
-              <w:t>FreeCAD</w:t>
-            </w:r>
-            <w:proofErr w:type="spellEnd"/>
-            <w:r>
-              <w:rPr>
-                <w:sz w:val="18"/>
-              </w:rPr>
-              <w:t xml:space="preserve"> / Fusion 360.</w:t>
+              <w:t>Design custom 3D enclosure and load-cell mechanical mounting platform in FreeCAD / Fusion 360.</w:t>
             </w:r>
           </w:p>
         </w:tc>
@@ -2861,21 +2753,12 @@
             </w:tcMar>
           </w:tcPr>
           <w:p>
-            <w:proofErr w:type="spellStart"/>
             <w:r>
               <w:rPr>
                 <w:b/>
                 <w:sz w:val="19"/>
               </w:rPr>
-              <w:t>Wokwi</w:t>
-            </w:r>
-            <w:proofErr w:type="spellEnd"/>
-            <w:r>
-              <w:rPr>
-                <w:b/>
-                <w:sz w:val="19"/>
-              </w:rPr>
-              <w:t xml:space="preserve"> ESP32 Simulation</w:t>
+              <w:t>Wokwi ESP32 Simulation</w:t>
             </w:r>
           </w:p>
         </w:tc>
@@ -2894,21 +2777,7 @@
               <w:rPr>
                 <w:sz w:val="18"/>
               </w:rPr>
-              <w:t xml:space="preserve">Simulate ESP32 firmware on </w:t>
-            </w:r>
-            <w:proofErr w:type="spellStart"/>
-            <w:r>
-              <w:rPr>
-                <w:sz w:val="18"/>
-              </w:rPr>
-              <w:t>Wokwi</w:t>
-            </w:r>
-            <w:proofErr w:type="spellEnd"/>
-            <w:r>
-              <w:rPr>
-                <w:sz w:val="18"/>
-              </w:rPr>
-              <w:t xml:space="preserve"> publishing live dummy telemetry over MQTT to broker.</w:t>
+              <w:t>Simulate ESP32 firmware on Wokwi publishing live dummy telemetry over MQTT to broker.</w:t>
             </w:r>
           </w:p>
         </w:tc>
@@ -2988,49 +2857,7 @@
               <w:rPr>
                 <w:sz w:val="18"/>
               </w:rPr>
-              <w:t xml:space="preserve">Spin up local Docker environment running </w:t>
-            </w:r>
-            <w:proofErr w:type="spellStart"/>
-            <w:r>
-              <w:rPr>
-                <w:sz w:val="18"/>
-              </w:rPr>
-              <w:t>Mosquitto</w:t>
-            </w:r>
-            <w:proofErr w:type="spellEnd"/>
-            <w:r>
-              <w:rPr>
-                <w:sz w:val="18"/>
-              </w:rPr>
-              <w:t xml:space="preserve"> MQTT broker, </w:t>
-            </w:r>
-            <w:proofErr w:type="spellStart"/>
-            <w:r>
-              <w:rPr>
-                <w:sz w:val="18"/>
-              </w:rPr>
-              <w:t>TimescaleDB</w:t>
-            </w:r>
-            <w:proofErr w:type="spellEnd"/>
-            <w:r>
-              <w:rPr>
-                <w:sz w:val="18"/>
-              </w:rPr>
-              <w:t xml:space="preserve">, and </w:t>
-            </w:r>
-            <w:proofErr w:type="spellStart"/>
-            <w:r>
-              <w:rPr>
-                <w:sz w:val="18"/>
-              </w:rPr>
-              <w:t>FastAPI</w:t>
-            </w:r>
-            <w:proofErr w:type="spellEnd"/>
-            <w:r>
-              <w:rPr>
-                <w:sz w:val="18"/>
-              </w:rPr>
-              <w:t xml:space="preserve"> REST API.</w:t>
+              <w:t>Spin up local Docker environment running Mosquitto MQTT broker, TimescaleDB, and FastAPI REST API.</w:t>
             </w:r>
           </w:p>
         </w:tc>
@@ -3398,21 +3225,7 @@
               <w:rPr>
                 <w:sz w:val="18"/>
               </w:rPr>
-              <w:t xml:space="preserve">Demonstrate full pipeline: </w:t>
-            </w:r>
-            <w:proofErr w:type="spellStart"/>
-            <w:r>
-              <w:rPr>
-                <w:sz w:val="18"/>
-              </w:rPr>
-              <w:t>Wokwi</w:t>
-            </w:r>
-            <w:proofErr w:type="spellEnd"/>
-            <w:r>
-              <w:rPr>
-                <w:sz w:val="18"/>
-              </w:rPr>
-              <w:t xml:space="preserve"> Node -&gt; MQTT -&gt; Database -&gt; Web Dashboard -&gt; AI Analytics.</w:t>
+              <w:t>Demonstrate full pipeline: Wokwi Node -&gt; MQTT -&gt; Database -&gt; Web Dashboard -&gt; AI Analytics.</w:t>
             </w:r>
           </w:p>
         </w:tc>
@@ -3492,21 +3305,7 @@
               <w:rPr>
                 <w:sz w:val="18"/>
               </w:rPr>
-              <w:t xml:space="preserve">Compile final Design Package and conduct Gate 1 Design Review with Anjana </w:t>
-            </w:r>
-            <w:proofErr w:type="spellStart"/>
-            <w:r>
-              <w:rPr>
-                <w:sz w:val="18"/>
-              </w:rPr>
-              <w:t>Suraweera</w:t>
-            </w:r>
-            <w:proofErr w:type="spellEnd"/>
-            <w:r>
-              <w:rPr>
-                <w:sz w:val="18"/>
-              </w:rPr>
-              <w:t>.</w:t>
+              <w:t>Compile final Design Package and conduct Gate 1 Design Review with Anjana Suraweera.</w:t>
             </w:r>
           </w:p>
         </w:tc>

</xml_diff>

<commit_message>
Add Week 4 deliverable : StockSense_Architecture_Specification.pdf ,StockSense_Component_Shortlist.pdf & StockSense MQTT & Data Specification.pdf
</commit_message>
<xml_diff>
--- a/StockSense_Interactive_Checklist.docx
+++ b/StockSense_Interactive_Checklist.docx
@@ -1527,7 +1527,7 @@
               <w:sdtPr>
                 <w:id w:val="929012601"/>
                 <w14:checkbox>
-                  <w14:checked w14:val="0"/>
+                  <w14:checked w14:val="1"/>
                   <w14:checkedState w14:val="2611" w14:font="MS Gothic"/>
                   <w14:uncheckedState w14:val="2610" w14:font="MS Gothic"/>
                 </w14:checkbox>
@@ -1538,7 +1538,7 @@
                   <w:rPr>
                     <w:rFonts w:ascii="MS Gothic" w:eastAsia="MS Gothic" w:hAnsi="MS Gothic" w:hint="eastAsia"/>
                   </w:rPr>
-                  <w:t>☐</w:t>
+                  <w:t>☑</w:t>
                 </w:r>
               </w:sdtContent>
             </w:sdt>
@@ -1607,7 +1607,7 @@
               <w:sdtPr>
                 <w:id w:val="-589242774"/>
                 <w14:checkbox>
-                  <w14:checked w14:val="0"/>
+                  <w14:checked w14:val="1"/>
                   <w14:checkedState w14:val="2611" w14:font="MS Gothic"/>
                   <w14:uncheckedState w14:val="2610" w14:font="MS Gothic"/>
                 </w14:checkbox>
@@ -1618,7 +1618,7 @@
                   <w:rPr>
                     <w:rFonts w:ascii="MS Gothic" w:eastAsia="MS Gothic" w:hAnsi="MS Gothic" w:hint="eastAsia"/>
                   </w:rPr>
-                  <w:t>☐</w:t>
+                  <w:t>☑</w:t>
                 </w:r>
               </w:sdtContent>
             </w:sdt>
@@ -1687,7 +1687,7 @@
               <w:sdtPr>
                 <w:id w:val="-449400202"/>
                 <w14:checkbox>
-                  <w14:checked w14:val="0"/>
+                  <w14:checked w14:val="1"/>
                   <w14:checkedState w14:val="2611" w14:font="MS Gothic"/>
                   <w14:uncheckedState w14:val="2610" w14:font="MS Gothic"/>
                 </w14:checkbox>
@@ -1698,7 +1698,7 @@
                   <w:rPr>
                     <w:rFonts w:ascii="MS Gothic" w:eastAsia="MS Gothic" w:hAnsi="MS Gothic" w:hint="eastAsia"/>
                   </w:rPr>
-                  <w:t>☐</w:t>
+                  <w:t>☑</w:t>
                 </w:r>
               </w:sdtContent>
             </w:sdt>

</xml_diff>